<commit_message>
docs: update user manual to v3.1 + add Developer & AI Handoff Manual
User manual (AWIVEST-Investor-Portal-Manual.docx) -> v3.1:
- Signing step rewritten for native draw/upload capture with the
  "Signature captured" confirmation and gated Sign & stamp button.
- Mobile note (16px fields, touch targets, swipeable tabs, no sideways scroll).
- Optional staff display title ("Super Admin" vs "Chairlady").
- Sample/internal accounts excluded from staff counts and totals.
- Staff email-health diagnostic note.
- New "What changed in version 3.1" appendix.

New AWIVEST-Developer-Handoff-Manual.docx (v1.0):
- Architecture, repo/env, data model, roles/access, subsystem map,
  achievements (~150 PRs), conventions, gotchas, and outstanding work.
- Written for the next developer or AI assistant. No secret values included.
</commit_message>
<xml_diff>
--- a/AWIVEST-Investor-Portal-Manual.docx
+++ b/AWIVEST-Investor-Portal-Manual.docx
@@ -47,7 +47,7 @@
         <w:rPr>
           <w:i/>
         </w:rPr>
-        <w:t>Version 3.0  ·  September 2026</w:t>
+        <w:t>Version 3.1  ·  September 2026</w:t>
       </w:r>
     </w:p>
     <w:p>
@@ -197,6 +197,14 @@
       </w:r>
       <w:r>
         <w:t>the top authority; everything an Admin does, plus final approval of member withdrawal requests.</w:t>
+      </w:r>
+    </w:p>
+    <w:p>
+      <w:pPr>
+        <w:pStyle w:val="ListBullet"/>
+      </w:pPr>
+      <w:r>
+        <w:t>Display title: a staff role can be shown under a custom title in the sidebar and header — for example “Super Admin” instead of “Chairlady” — without changing any permissions.</w:t>
       </w:r>
     </w:p>
     <w:p>
@@ -905,6 +913,14 @@
       </w:r>
     </w:p>
     <w:p>
+      <w:pPr>
+        <w:pStyle w:val="ListBullet"/>
+      </w:pPr>
+      <w:r>
+        <w:t>Built for phones as well as computers: form fields stay a comfortable size (no unexpected zoom on iPhone), buttons and menu items are sized for touch, section tabs and toolbars scroll sideways in a single row, and pages never scroll sideways by accident.</w:t>
+      </w:r>
+    </w:p>
+    <w:p>
       <w:r>
         <w:br w:type="page"/>
       </w:r>
@@ -1052,7 +1068,7 @@
         <w:ind w:left="360"/>
       </w:pPr>
       <w:r>
-        <w:t>Open the secure e-sign link, sign, then return and refresh the status. If you click “I have signed” before actually signing, the portal tells you the signature has not been received yet.</w:t>
+        <w:t>For each agreement, type your full name and add your signature — either draw it on screen or upload a clear photo or scan (PNG or JPG; an iPhone HEIC photo may need converting to JPG first). The form confirms “Signature captured” once your signature is ready, and “Sign &amp; stamp” stays disabled until then, so an empty signature can never be submitted. If the office instead provides an external e-sign link, open it, sign, then return and refresh the status.</w:t>
       </w:r>
     </w:p>
     <w:p>
@@ -1583,6 +1599,14 @@
         <w:pStyle w:val="ListBullet"/>
       </w:pPr>
       <w:r>
+        <w:t>Member counts and total balances shown to staff exclude demo/sample and internal fund accounts, so the figures reflect real members only.</w:t>
+      </w:r>
+    </w:p>
+    <w:p>
+      <w:pPr>
+        <w:pStyle w:val="ListBullet"/>
+      </w:pPr>
+      <w:r>
         <w:rPr>
           <w:b/>
         </w:rPr>
@@ -2009,6 +2033,14 @@
       </w:r>
       <w:r>
         <w:t>set the PandaDoc onboarding and one-off template IDs and the signer role, and run the connection test / onboarding-document preview.</w:t>
+      </w:r>
+    </w:p>
+    <w:p>
+      <w:pPr>
+        <w:pStyle w:val="ListBullet"/>
+      </w:pPr>
+      <w:r>
+        <w:t>Email health: a staff diagnostic page confirms the email service is configured and lets you send a live test message to verify delivery.</w:t>
       </w:r>
     </w:p>
     <w:p>
@@ -2368,6 +2400,86 @@
       </w:r>
       <w:r>
         <w:t>paying money out — a withdrawal, refund or welfare payment; reserved for Admin and Chairlady.</w:t>
+      </w:r>
+    </w:p>
+    <w:p>
+      <w:pPr>
+        <w:pStyle w:val="Heading2"/>
+      </w:pPr>
+      <w:r>
+        <w:t>Appendix — What changed in version 3.1</w:t>
+      </w:r>
+    </w:p>
+    <w:p>
+      <w:pPr>
+        <w:pStyle w:val="ListBullet"/>
+      </w:pPr>
+      <w:r>
+        <w:t>Reliable signature capture on phones. When signing an agreement you can draw your signature or upload a photo/scan; the form confirms “Signature captured” and the “Sign &amp; stamp” button stays disabled until a signature is present, so a false “add your signature” message can no longer block you.</w:t>
+      </w:r>
+    </w:p>
+    <w:p>
+      <w:pPr>
+        <w:pStyle w:val="ListBullet"/>
+      </w:pPr>
+      <w:r>
+        <w:t>Mobile experience pass across the whole portal: form fields no longer zoom unexpectedly on iPhone, buttons and menu items are sized for touch, section tabs and toolbars scroll sideways in a single row, and pages never scroll sideways by accident.</w:t>
+      </w:r>
+    </w:p>
+    <w:p>
+      <w:pPr>
+        <w:pStyle w:val="ListBullet"/>
+      </w:pPr>
+      <w:r>
+        <w:t>Optional display title for staff roles — for example showing “Super Admin” instead of “Chairlady” — without changing any permissions.</w:t>
+      </w:r>
+    </w:p>
+    <w:p>
+      <w:pPr>
+        <w:pStyle w:val="ListBullet"/>
+      </w:pPr>
+      <w:r>
+        <w:t>Demo/sample and internal fund accounts are now excluded from member counts and total balances everywhere they appear (dashboard, reports, member statements and fund data), so the figures reflect real members only.</w:t>
+      </w:r>
+    </w:p>
+    <w:p>
+      <w:pPr>
+        <w:pStyle w:val="ListBullet"/>
+      </w:pPr>
+      <w:r>
+        <w:t>Transactional email is live (email verification codes, approval notices and withdrawal updates), with a staff email-health page that confirms the service is configured and can send a live test message.</w:t>
+      </w:r>
+    </w:p>
+    <w:p>
+      <w:pPr>
+        <w:pStyle w:val="ListBullet"/>
+      </w:pPr>
+      <w:r>
+        <w:t>Reports: a full multi-tab fund workbook export in the AWI brand colours, including a member register table.</w:t>
+      </w:r>
+    </w:p>
+    <w:p>
+      <w:pPr>
+        <w:pStyle w:val="ListBullet"/>
+      </w:pPr>
+      <w:r>
+        <w:t>Fund data: contributions can be recorded with a fund type (contribution, membership or welfare).</w:t>
+      </w:r>
+    </w:p>
+    <w:p>
+      <w:pPr>
+        <w:pStyle w:val="ListBullet"/>
+      </w:pPr>
+      <w:r>
+        <w:t>Money is shown to the exact cent throughout — no rounding to whole shillings.</w:t>
+      </w:r>
+    </w:p>
+    <w:p>
+      <w:pPr>
+        <w:pStyle w:val="ListBullet"/>
+      </w:pPr>
+      <w:r>
+        <w:t>Performance and security hardening: application servers co-located with the database for faster pages, per-request de-duplication of sign-in checks, a Content-Security-Policy, a fail-closed two-factor signing secret, and stricter file-upload checks.</w:t>
       </w:r>
     </w:p>
     <w:p>

</xml_diff>

<commit_message>
docs(brand): apply AWI branding to the investor manual (logo, colours, contacts)
- AWI logo on the cover (centred) and in the running header (pages 2+).
- Headings recoloured to AWI palette from the Digital Transformation
  proposal: H1/H3 plum #7A1E50, H2 magenta #B22C75; H1 gains a plum brand rule.
- Cover title/subtitle recoloured; centred cover block with tagline
  "African Women Investors" in AWI green #61CE70.
- Website www.awivest.com, info@awivest.com and +254 748 475 347 added on the
  cover and in the footer on every page (with page numbers).
- Built on the v3.1 content (keeps the signature/mobile/roles/email updates
  and the v3.1 change appendix).
</commit_message>
<xml_diff>
--- a/AWIVEST-Investor-Portal-Manual.docx
+++ b/AWIVEST-Investor-Portal-Manual.docx
@@ -7,9 +7,48 @@
         <w:jc w:val="center"/>
       </w:pPr>
       <w:r>
+        <w:drawing>
+          <wp:inline xmlns:a="http://schemas.openxmlformats.org/drawingml/2006/main" xmlns:pic="http://schemas.openxmlformats.org/drawingml/2006/picture">
+            <wp:extent cx="2743200" cy="732639"/>
+            <wp:docPr id="1" name="Picture 1"/>
+            <wp:cNvGraphicFramePr>
+              <a:graphicFrameLocks noChangeAspect="1"/>
+            </wp:cNvGraphicFramePr>
+            <a:graphic>
+              <a:graphicData uri="http://schemas.openxmlformats.org/drawingml/2006/picture">
+                <pic:pic>
+                  <pic:nvPicPr>
+                    <pic:cNvPr id="0" name="AWI-Logo.png"/>
+                    <pic:cNvPicPr/>
+                  </pic:nvPicPr>
+                  <pic:blipFill>
+                    <a:blip r:embed="rId9"/>
+                    <a:stretch>
+                      <a:fillRect/>
+                    </a:stretch>
+                  </pic:blipFill>
+                  <pic:spPr>
+                    <a:xfrm>
+                      <a:off x="0" y="0"/>
+                      <a:ext cx="2743200" cy="732639"/>
+                    </a:xfrm>
+                    <a:prstGeom prst="rect"/>
+                  </pic:spPr>
+                </pic:pic>
+              </a:graphicData>
+            </a:graphic>
+          </wp:inline>
+        </w:drawing>
+      </w:r>
+    </w:p>
+    <w:p>
+      <w:pPr>
+        <w:jc w:val="center"/>
+      </w:pPr>
+      <w:r>
         <w:rPr>
           <w:b/>
-          <w:color w:val="4B2E83"/>
+          <w:color w:val="7A1E50"/>
           <w:sz w:val="60"/>
         </w:rPr>
         <w:t>AWIVEST Investor Portal</w:t>
@@ -21,7 +60,8 @@
       </w:pPr>
       <w:r>
         <w:rPr>
-          <w:color w:val="6F8F1E"/>
+          <w:b/>
+          <w:color w:val="B22C75"/>
           <w:sz w:val="36"/>
         </w:rPr>
         <w:t>System &amp; Navigation Manual</w:t>
@@ -33,7 +73,7 @@
       </w:pPr>
       <w:r>
         <w:rPr>
-          <w:color w:val="555555"/>
+          <w:color w:val="666666"/>
           <w:sz w:val="24"/>
         </w:rPr>
         <w:t>Investor · Secretary · Admin · Chairlady</w:t>
@@ -46,8 +86,36 @@
       <w:r>
         <w:rPr>
           <w:i/>
+          <w:color w:val="666666"/>
+          <w:sz w:val="22"/>
         </w:rPr>
         <w:t>Version 3.1  ·  September 2026</w:t>
+      </w:r>
+    </w:p>
+    <w:p>
+      <w:pPr>
+        <w:jc w:val="center"/>
+      </w:pPr>
+      <w:r>
+        <w:rPr>
+          <w:b/>
+          <w:color w:val="7A1E50"/>
+          <w:sz w:val="22"/>
+        </w:rPr>
+        <w:t>www.awivest.com     ·     info@awivest.com     ·     +254 748 475 347</w:t>
+      </w:r>
+    </w:p>
+    <w:p>
+      <w:pPr>
+        <w:jc w:val="center"/>
+      </w:pPr>
+      <w:r>
+        <w:rPr>
+          <w:b/>
+          <w:color w:val="61CE70"/>
+          <w:sz w:val="21"/>
+        </w:rPr>
+        <w:t>African Women Investors</w:t>
       </w:r>
     </w:p>
     <w:p>
@@ -56,6 +124,11 @@
           <w:b w:val="0"/>
           <w:i w:val="0"/>
         </w:rPr>
+      </w:r>
+    </w:p>
+    <w:p>
+      <w:r>
+        <w:br w:type="page"/>
       </w:r>
     </w:p>
     <w:p>
@@ -2536,13 +2609,142 @@
       </w:r>
     </w:p>
     <w:sectPr>
+      <w:headerReference w:type="default" r:id="rId10"/>
+      <w:footerReference w:type="default" r:id="rId11"/>
+      <w:footerReference w:type="first" r:id="rId12"/>
       <w:pgSz w:w="12240" w:h="15840"/>
       <w:pgMar w:top="1440" w:right="1800" w:bottom="1440" w:left="1800" w:header="720" w:footer="720" w:gutter="0"/>
       <w:cols w:space="720"/>
+      <w:titlePg/>
       <w:docGrid w:linePitch="360"/>
     </w:sectPr>
   </w:body>
 </w:document>
+</file>
+
+<file path=word/footer1.xml><?xml version="1.0" encoding="utf-8"?>
+<w:ftr xmlns:m="http://schemas.openxmlformats.org/officeDocument/2006/math" xmlns:mc="http://schemas.openxmlformats.org/markup-compatibility/2006" xmlns:mo="http://schemas.microsoft.com/office/mac/office/2008/main" xmlns:mv="urn:schemas-microsoft-com:mac:vml" xmlns:o="urn:schemas-microsoft-com:office:office" xmlns:r="http://schemas.openxmlformats.org/officeDocument/2006/relationships" xmlns:v="urn:schemas-microsoft-com:vml" xmlns:w10="urn:schemas-microsoft-com:office:word" xmlns:w14="http://schemas.microsoft.com/office/word/2010/wordml" xmlns:w="http://schemas.openxmlformats.org/wordprocessingml/2006/main" xmlns:wne="http://schemas.microsoft.com/office/word/2006/wordml" xmlns:wp14="http://schemas.microsoft.com/office/word/2010/wordprocessingDrawing" xmlns:wp="http://schemas.openxmlformats.org/drawingml/2006/wordprocessingDrawing" xmlns:wpc="http://schemas.microsoft.com/office/word/2010/wordprocessingCanvas" xmlns:wpg="http://schemas.microsoft.com/office/word/2010/wordprocessingGroup" xmlns:wpi="http://schemas.microsoft.com/office/word/2010/wordprocessingInk" xmlns:wps="http://schemas.microsoft.com/office/word/2010/wordprocessingShape" mc:Ignorable="w14 wp14">
+  <w:p>
+    <w:pPr>
+      <w:pStyle w:val="Footer"/>
+      <w:jc w:val="center"/>
+    </w:pPr>
+    <w:r/>
+    <w:r>
+      <w:rPr>
+        <w:color w:val="7A1E50"/>
+        <w:sz w:val="17"/>
+      </w:rPr>
+      <w:t>www.awivest.com     ·     info@awivest.com     ·     +254 748 475 347</w:t>
+    </w:r>
+  </w:p>
+  <w:p>
+    <w:pPr>
+      <w:jc w:val="center"/>
+    </w:pPr>
+    <w:r>
+      <w:rPr>
+        <w:color w:val="666666"/>
+        <w:sz w:val="16"/>
+      </w:rPr>
+      <w:t xml:space="preserve">AWIVEST — African Women Investors     ·     Page </w:t>
+    </w:r>
+    <w:r>
+      <w:rPr>
+        <w:color w:val="666666"/>
+        <w:sz w:val="16"/>
+      </w:rPr>
+      <w:fldChar w:fldCharType="begin"/>
+      <w:instrText xml:space="preserve"> PAGE </w:instrText>
+      <w:fldChar w:fldCharType="end"/>
+    </w:r>
+  </w:p>
+</w:ftr>
+</file>
+
+<file path=word/footer2.xml><?xml version="1.0" encoding="utf-8"?>
+<w:ftr xmlns:m="http://schemas.openxmlformats.org/officeDocument/2006/math" xmlns:mc="http://schemas.openxmlformats.org/markup-compatibility/2006" xmlns:mo="http://schemas.microsoft.com/office/mac/office/2008/main" xmlns:mv="urn:schemas-microsoft-com:mac:vml" xmlns:o="urn:schemas-microsoft-com:office:office" xmlns:r="http://schemas.openxmlformats.org/officeDocument/2006/relationships" xmlns:v="urn:schemas-microsoft-com:vml" xmlns:w10="urn:schemas-microsoft-com:office:word" xmlns:w14="http://schemas.microsoft.com/office/word/2010/wordml" xmlns:w="http://schemas.openxmlformats.org/wordprocessingml/2006/main" xmlns:wne="http://schemas.microsoft.com/office/word/2006/wordml" xmlns:wp14="http://schemas.microsoft.com/office/word/2010/wordprocessingDrawing" xmlns:wp="http://schemas.openxmlformats.org/drawingml/2006/wordprocessingDrawing" xmlns:wpc="http://schemas.microsoft.com/office/word/2010/wordprocessingCanvas" xmlns:wpg="http://schemas.microsoft.com/office/word/2010/wordprocessingGroup" xmlns:wpi="http://schemas.microsoft.com/office/word/2010/wordprocessingInk" xmlns:wps="http://schemas.microsoft.com/office/word/2010/wordprocessingShape" mc:Ignorable="w14 wp14">
+  <w:p>
+    <w:pPr>
+      <w:pStyle w:val="Footer"/>
+      <w:jc w:val="center"/>
+    </w:pPr>
+    <w:r/>
+    <w:r>
+      <w:rPr>
+        <w:color w:val="7A1E50"/>
+        <w:sz w:val="17"/>
+      </w:rPr>
+      <w:t>www.awivest.com     ·     info@awivest.com     ·     +254 748 475 347</w:t>
+    </w:r>
+  </w:p>
+  <w:p>
+    <w:pPr>
+      <w:jc w:val="center"/>
+    </w:pPr>
+    <w:r>
+      <w:rPr>
+        <w:color w:val="666666"/>
+        <w:sz w:val="16"/>
+      </w:rPr>
+      <w:t xml:space="preserve">AWIVEST — African Women Investors     ·     Page </w:t>
+    </w:r>
+    <w:r>
+      <w:rPr>
+        <w:color w:val="666666"/>
+        <w:sz w:val="16"/>
+      </w:rPr>
+      <w:fldChar w:fldCharType="begin"/>
+      <w:instrText xml:space="preserve"> PAGE </w:instrText>
+      <w:fldChar w:fldCharType="end"/>
+    </w:r>
+  </w:p>
+</w:ftr>
+</file>
+
+<file path=word/header1.xml><?xml version="1.0" encoding="utf-8"?>
+<w:hdr xmlns:m="http://schemas.openxmlformats.org/officeDocument/2006/math" xmlns:mc="http://schemas.openxmlformats.org/markup-compatibility/2006" xmlns:mo="http://schemas.microsoft.com/office/mac/office/2008/main" xmlns:mv="urn:schemas-microsoft-com:mac:vml" xmlns:o="urn:schemas-microsoft-com:office:office" xmlns:r="http://schemas.openxmlformats.org/officeDocument/2006/relationships" xmlns:v="urn:schemas-microsoft-com:vml" xmlns:w10="urn:schemas-microsoft-com:office:word" xmlns:w14="http://schemas.microsoft.com/office/word/2010/wordml" xmlns:w="http://schemas.openxmlformats.org/wordprocessingml/2006/main" xmlns:wne="http://schemas.microsoft.com/office/word/2006/wordml" xmlns:wp14="http://schemas.microsoft.com/office/word/2010/wordprocessingDrawing" xmlns:wp="http://schemas.openxmlformats.org/drawingml/2006/wordprocessingDrawing" xmlns:wpc="http://schemas.microsoft.com/office/word/2010/wordprocessingCanvas" xmlns:wpg="http://schemas.microsoft.com/office/word/2010/wordprocessingGroup" xmlns:wpi="http://schemas.microsoft.com/office/word/2010/wordprocessingInk" xmlns:wps="http://schemas.microsoft.com/office/word/2010/wordprocessingShape" mc:Ignorable="w14 wp14">
+  <w:p>
+    <w:pPr>
+      <w:pStyle w:val="Header"/>
+      <w:jc w:val="right"/>
+    </w:pPr>
+    <w:r>
+      <w:drawing>
+        <wp:inline xmlns:a="http://schemas.openxmlformats.org/drawingml/2006/main" xmlns:pic="http://schemas.openxmlformats.org/drawingml/2006/picture">
+          <wp:extent cx="1234440" cy="329687"/>
+          <wp:docPr id="1" name="Picture 1"/>
+          <wp:cNvGraphicFramePr>
+            <a:graphicFrameLocks noChangeAspect="1"/>
+          </wp:cNvGraphicFramePr>
+          <a:graphic>
+            <a:graphicData uri="http://schemas.openxmlformats.org/drawingml/2006/picture">
+              <pic:pic>
+                <pic:nvPicPr>
+                  <pic:cNvPr id="0" name="AWI-Logo.png"/>
+                  <pic:cNvPicPr/>
+                </pic:nvPicPr>
+                <pic:blipFill>
+                  <a:blip r:embed="rId1"/>
+                  <a:stretch>
+                    <a:fillRect/>
+                  </a:stretch>
+                </pic:blipFill>
+                <pic:spPr>
+                  <a:xfrm>
+                    <a:off x="0" y="0"/>
+                    <a:ext cx="1234440" cy="329687"/>
+                  </a:xfrm>
+                  <a:prstGeom prst="rect"/>
+                </pic:spPr>
+              </pic:pic>
+            </a:graphicData>
+          </a:graphic>
+        </wp:inline>
+      </w:drawing>
+    </w:r>
+  </w:p>
+</w:hdr>
 </file>
 
 <file path=word/numbering.xml><?xml version="1.0" encoding="utf-8"?>
@@ -2970,12 +3172,15 @@
       <w:keepLines/>
       <w:spacing w:before="480" w:after="0"/>
       <w:outlineLvl w:val="0"/>
+      <w:pBdr>
+        <w:bottom w:val="single" w:sz="16" w:space="4" w:color="7A1E50"/>
+      </w:pBdr>
     </w:pPr>
     <w:rPr>
       <w:rFonts w:asciiTheme="majorHAnsi" w:eastAsiaTheme="majorEastAsia" w:hAnsiTheme="majorHAnsi" w:cstheme="majorBidi"/>
       <w:b/>
       <w:bCs/>
-      <w:color w:val="365F91" w:themeColor="accent1" w:themeShade="BF"/>
+      <w:color w:val="7A1E50"/>
       <w:sz w:val="28"/>
       <w:szCs w:val="28"/>
     </w:rPr>
@@ -2999,7 +3204,7 @@
       <w:rFonts w:asciiTheme="majorHAnsi" w:eastAsiaTheme="majorEastAsia" w:hAnsiTheme="majorHAnsi" w:cstheme="majorBidi"/>
       <w:b/>
       <w:bCs/>
-      <w:color w:val="4F81BD" w:themeColor="accent1"/>
+      <w:color w:val="B22C75"/>
       <w:sz w:val="26"/>
       <w:szCs w:val="26"/>
     </w:rPr>
@@ -3023,7 +3228,7 @@
       <w:rFonts w:asciiTheme="majorHAnsi" w:eastAsiaTheme="majorEastAsia" w:hAnsiTheme="majorHAnsi" w:cstheme="majorBidi"/>
       <w:b/>
       <w:bCs/>
-      <w:color w:val="4F81BD" w:themeColor="accent1"/>
+      <w:color w:val="7A1E50"/>
     </w:rPr>
   </w:style>
   <w:style w:type="paragraph" w:styleId="Heading4">

</xml_diff>